<commit_message>
RabbitMQ: truong hop gui message thanh cong
</commit_message>
<xml_diff>
--- a/Tuan01/MinhChungTuan1.docx
+++ b/Tuan01/MinhChungTuan1.docx
@@ -1,10 +1,512 @@
 
 <file path=word/document.xml><?xml version="1.0" encoding="utf-8"?>
-<w:document xmlns:wpc="http://schemas.microsoft.com/office/word/2010/wordprocessingCanvas" xmlns:mc="http://schemas.openxmlformats.org/markup-compatibility/2006" xmlns:o="urn:schemas-microsoft-com:office:office" xmlns:r="http://schemas.openxmlformats.org/officeDocument/2006/relationships" xmlns:m="http://schemas.openxmlformats.org/officeDocument/2006/math" xmlns:v="urn:schemas-microsoft-com:vml" xmlns:wp14="http://schemas.microsoft.com/office/word/2010/wordprocessingDrawing" xmlns:wp="http://schemas.openxmlformats.org/drawingml/2006/wordprocessingDrawing" xmlns:w10="urn:schemas-microsoft-com:office:word" xmlns:w="http://schemas.openxmlformats.org/wordprocessingml/2006/main" xmlns:w14="http://schemas.microsoft.com/office/word/2010/wordml" xmlns:w15="http://schemas.microsoft.com/office/word/2012/wordml" xmlns:wpg="http://schemas.microsoft.com/office/word/2010/wordprocessingGroup" xmlns:wpi="http://schemas.microsoft.com/office/word/2010/wordprocessingInk" xmlns:wne="http://schemas.microsoft.com/office/word/2006/wordml" xmlns:wps="http://schemas.microsoft.com/office/word/2010/wordprocessingShape" mc:Ignorable="w14 w15 wp14">
+<w:document xmlns:wpc="http://schemas.microsoft.com/office/word/2010/wordprocessingCanvas" xmlns:cx="http://schemas.microsoft.com/office/drawing/2014/chartex" xmlns:cx1="http://schemas.microsoft.com/office/drawing/2015/9/8/chartex" xmlns:cx2="http://schemas.microsoft.com/office/drawing/2015/10/21/chartex" xmlns:cx3="http://schemas.microsoft.com/office/drawing/2016/5/9/chartex" xmlns:cx4="http://schemas.microsoft.com/office/drawing/2016/5/10/chartex" xmlns:cx5="http://schemas.microsoft.com/office/drawing/2016/5/11/chartex" xmlns:cx6="http://schemas.microsoft.com/office/drawing/2016/5/12/chartex" xmlns:cx7="http://schemas.microsoft.com/office/drawing/2016/5/13/chartex" xmlns:cx8="http://schemas.microsoft.com/office/drawing/2016/5/14/chartex" xmlns:mc="http://schemas.openxmlformats.org/markup-compatibility/2006" xmlns:aink="http://schemas.microsoft.com/office/drawing/2016/ink" xmlns:am3d="http://schemas.microsoft.com/office/drawing/2017/model3d" xmlns:o="urn:schemas-microsoft-com:office:office" xmlns:r="http://schemas.openxmlformats.org/officeDocument/2006/relationships" xmlns:m="http://schemas.openxmlformats.org/officeDocument/2006/math" xmlns:v="urn:schemas-microsoft-com:vml" xmlns:wp14="http://schemas.microsoft.com/office/word/2010/wordprocessingDrawing" xmlns:wp="http://schemas.openxmlformats.org/drawingml/2006/wordprocessingDrawing" xmlns:w10="urn:schemas-microsoft-com:office:word" xmlns:w="http://schemas.openxmlformats.org/wordprocessingml/2006/main" xmlns:w14="http://schemas.microsoft.com/office/word/2010/wordml" xmlns:w15="http://schemas.microsoft.com/office/word/2012/wordml" xmlns:w16cex="http://schemas.microsoft.com/office/word/2018/wordml/cex" xmlns:w16cid="http://schemas.microsoft.com/office/word/2016/wordml/cid" xmlns:w16="http://schemas.microsoft.com/office/word/2018/wordml" xmlns:w16sdtdh="http://schemas.microsoft.com/office/word/2020/wordml/sdtdatahash" xmlns:w16se="http://schemas.microsoft.com/office/word/2015/wordml/symex" xmlns:wpg="http://schemas.microsoft.com/office/word/2010/wordprocessingGroup" xmlns:wpi="http://schemas.microsoft.com/office/word/2010/wordprocessingInk" xmlns:wne="http://schemas.microsoft.com/office/word/2006/wordml" xmlns:wps="http://schemas.microsoft.com/office/word/2010/wordprocessingShape" mc:Ignorable="w14 w15 w16se w16cid w16 w16cex w16sdtdh wp14">
   <w:body>
     <w:p>
-      <w:bookmarkStart w:id="0" w:name="_GoBack"/>
-      <w:bookmarkEnd w:id="0"/>
+      <w:pPr>
+        <w:jc w:val="center"/>
+        <w:rPr>
+          <w:rFonts w:ascii="Times New Roman" w:hAnsi="Times New Roman" w:cs="Times New Roman"/>
+          <w:b/>
+          <w:bCs/>
+          <w:sz w:val="40"/>
+          <w:szCs w:val="40"/>
+        </w:rPr>
+      </w:pPr>
+      <w:r>
+        <w:rPr>
+          <w:rFonts w:ascii="Times New Roman" w:hAnsi="Times New Roman" w:cs="Times New Roman"/>
+          <w:b/>
+          <w:bCs/>
+          <w:sz w:val="40"/>
+          <w:szCs w:val="40"/>
+        </w:rPr>
+        <w:t>RabbitMQ</w:t>
+      </w:r>
+    </w:p>
+    <w:p>
+      <w:pPr>
+        <w:pStyle w:val="oancuaDanhsach"/>
+        <w:numPr>
+          <w:ilvl w:val="0"/>
+          <w:numId w:val="1"/>
+        </w:numPr>
+        <w:rPr>
+          <w:rFonts w:ascii="Times New Roman" w:hAnsi="Times New Roman" w:cs="Times New Roman"/>
+          <w:sz w:val="24"/>
+          <w:szCs w:val="24"/>
+        </w:rPr>
+      </w:pPr>
+      <w:r>
+        <w:rPr>
+          <w:rFonts w:ascii="Times New Roman" w:hAnsi="Times New Roman" w:cs="Times New Roman"/>
+          <w:sz w:val="24"/>
+          <w:szCs w:val="24"/>
+        </w:rPr>
+        <w:t>Docker build</w:t>
+      </w:r>
+    </w:p>
+    <w:p>
+      <w:pPr>
+        <w:rPr>
+          <w:rFonts w:ascii="Times New Roman" w:hAnsi="Times New Roman" w:cs="Times New Roman"/>
+          <w:sz w:val="24"/>
+          <w:szCs w:val="24"/>
+        </w:rPr>
+      </w:pPr>
+      <w:r>
+        <w:rPr>
+          <w:rFonts w:ascii="Times New Roman" w:hAnsi="Times New Roman" w:cs="Times New Roman"/>
+          <w:sz w:val="24"/>
+          <w:szCs w:val="24"/>
+        </w:rPr>
+        <w:drawing>
+          <wp:inline distT="0" distB="0" distL="0" distR="0" wp14:anchorId="1E065A50" wp14:editId="39B5BB5B">
+            <wp:extent cx="5943600" cy="3344545"/>
+            <wp:effectExtent l="0" t="0" r="0" b="8255"/>
+            <wp:docPr id="1" name="Hình ảnh 1"/>
+            <wp:cNvGraphicFramePr>
+              <a:graphicFrameLocks xmlns:a="http://schemas.openxmlformats.org/drawingml/2006/main" noChangeAspect="1"/>
+            </wp:cNvGraphicFramePr>
+            <a:graphic xmlns:a="http://schemas.openxmlformats.org/drawingml/2006/main">
+              <a:graphicData uri="http://schemas.openxmlformats.org/drawingml/2006/picture">
+                <pic:pic xmlns:pic="http://schemas.openxmlformats.org/drawingml/2006/picture">
+                  <pic:nvPicPr>
+                    <pic:cNvPr id="1" name=""/>
+                    <pic:cNvPicPr/>
+                  </pic:nvPicPr>
+                  <pic:blipFill>
+                    <a:blip r:embed="rId5"/>
+                    <a:stretch>
+                      <a:fillRect/>
+                    </a:stretch>
+                  </pic:blipFill>
+                  <pic:spPr>
+                    <a:xfrm>
+                      <a:off x="0" y="0"/>
+                      <a:ext cx="5943600" cy="3344545"/>
+                    </a:xfrm>
+                    <a:prstGeom prst="rect">
+                      <a:avLst/>
+                    </a:prstGeom>
+                  </pic:spPr>
+                </pic:pic>
+              </a:graphicData>
+            </a:graphic>
+          </wp:inline>
+        </w:drawing>
+      </w:r>
+    </w:p>
+    <w:p>
+      <w:pPr>
+        <w:pStyle w:val="oancuaDanhsach"/>
+        <w:numPr>
+          <w:ilvl w:val="0"/>
+          <w:numId w:val="1"/>
+        </w:numPr>
+        <w:rPr>
+          <w:rFonts w:ascii="Times New Roman" w:hAnsi="Times New Roman" w:cs="Times New Roman"/>
+          <w:sz w:val="24"/>
+          <w:szCs w:val="24"/>
+        </w:rPr>
+      </w:pPr>
+      <w:r>
+        <w:rPr>
+          <w:rFonts w:ascii="Times New Roman" w:hAnsi="Times New Roman" w:cs="Times New Roman"/>
+          <w:sz w:val="24"/>
+          <w:szCs w:val="24"/>
+        </w:rPr>
+        <w:t>Docker up</w:t>
+      </w:r>
+    </w:p>
+    <w:p>
+      <w:pPr>
+        <w:rPr>
+          <w:rFonts w:ascii="Times New Roman" w:hAnsi="Times New Roman" w:cs="Times New Roman"/>
+          <w:sz w:val="24"/>
+          <w:szCs w:val="24"/>
+        </w:rPr>
+      </w:pPr>
+      <w:r>
+        <w:rPr>
+          <w:rFonts w:ascii="Times New Roman" w:hAnsi="Times New Roman" w:cs="Times New Roman"/>
+          <w:sz w:val="24"/>
+          <w:szCs w:val="24"/>
+        </w:rPr>
+        <w:drawing>
+          <wp:inline distT="0" distB="0" distL="0" distR="0" wp14:anchorId="4167D908" wp14:editId="026B0296">
+            <wp:extent cx="5943600" cy="3342005"/>
+            <wp:effectExtent l="0" t="0" r="0" b="0"/>
+            <wp:docPr id="2" name="Hình ảnh 2"/>
+            <wp:cNvGraphicFramePr>
+              <a:graphicFrameLocks xmlns:a="http://schemas.openxmlformats.org/drawingml/2006/main" noChangeAspect="1"/>
+            </wp:cNvGraphicFramePr>
+            <a:graphic xmlns:a="http://schemas.openxmlformats.org/drawingml/2006/main">
+              <a:graphicData uri="http://schemas.openxmlformats.org/drawingml/2006/picture">
+                <pic:pic xmlns:pic="http://schemas.openxmlformats.org/drawingml/2006/picture">
+                  <pic:nvPicPr>
+                    <pic:cNvPr id="1" name=""/>
+                    <pic:cNvPicPr/>
+                  </pic:nvPicPr>
+                  <pic:blipFill>
+                    <a:blip r:embed="rId6"/>
+                    <a:stretch>
+                      <a:fillRect/>
+                    </a:stretch>
+                  </pic:blipFill>
+                  <pic:spPr>
+                    <a:xfrm>
+                      <a:off x="0" y="0"/>
+                      <a:ext cx="5943600" cy="3342005"/>
+                    </a:xfrm>
+                    <a:prstGeom prst="rect">
+                      <a:avLst/>
+                    </a:prstGeom>
+                  </pic:spPr>
+                </pic:pic>
+              </a:graphicData>
+            </a:graphic>
+          </wp:inline>
+        </w:drawing>
+      </w:r>
+    </w:p>
+    <w:p>
+      <w:pPr>
+        <w:rPr>
+          <w:rFonts w:ascii="Times New Roman" w:hAnsi="Times New Roman" w:cs="Times New Roman"/>
+          <w:sz w:val="24"/>
+          <w:szCs w:val="24"/>
+        </w:rPr>
+      </w:pPr>
+    </w:p>
+    <w:p>
+      <w:pPr>
+        <w:pStyle w:val="oancuaDanhsach"/>
+        <w:numPr>
+          <w:ilvl w:val="0"/>
+          <w:numId w:val="1"/>
+        </w:numPr>
+        <w:rPr>
+          <w:rFonts w:ascii="Times New Roman" w:hAnsi="Times New Roman" w:cs="Times New Roman"/>
+          <w:sz w:val="24"/>
+          <w:szCs w:val="24"/>
+        </w:rPr>
+      </w:pPr>
+      <w:r>
+        <w:rPr>
+          <w:rFonts w:ascii="Times New Roman" w:hAnsi="Times New Roman" w:cs="Times New Roman"/>
+          <w:sz w:val="24"/>
+          <w:szCs w:val="24"/>
+        </w:rPr>
+        <w:lastRenderedPageBreak/>
+        <w:t>Login rabbitMq</w:t>
+      </w:r>
+    </w:p>
+    <w:p>
+      <w:pPr>
+        <w:rPr>
+          <w:rFonts w:ascii="Times New Roman" w:hAnsi="Times New Roman" w:cs="Times New Roman"/>
+          <w:sz w:val="24"/>
+          <w:szCs w:val="24"/>
+        </w:rPr>
+      </w:pPr>
+      <w:r>
+        <w:rPr>
+          <w:rFonts w:ascii="Times New Roman" w:hAnsi="Times New Roman" w:cs="Times New Roman"/>
+          <w:sz w:val="24"/>
+          <w:szCs w:val="24"/>
+        </w:rPr>
+        <w:drawing>
+          <wp:inline distT="0" distB="0" distL="0" distR="0" wp14:anchorId="34C66B4B" wp14:editId="414C5592">
+            <wp:extent cx="5943600" cy="3331845"/>
+            <wp:effectExtent l="0" t="0" r="0" b="1905"/>
+            <wp:docPr id="4" name="Hình ảnh 4"/>
+            <wp:cNvGraphicFramePr>
+              <a:graphicFrameLocks xmlns:a="http://schemas.openxmlformats.org/drawingml/2006/main" noChangeAspect="1"/>
+            </wp:cNvGraphicFramePr>
+            <a:graphic xmlns:a="http://schemas.openxmlformats.org/drawingml/2006/main">
+              <a:graphicData uri="http://schemas.openxmlformats.org/drawingml/2006/picture">
+                <pic:pic xmlns:pic="http://schemas.openxmlformats.org/drawingml/2006/picture">
+                  <pic:nvPicPr>
+                    <pic:cNvPr id="1" name=""/>
+                    <pic:cNvPicPr/>
+                  </pic:nvPicPr>
+                  <pic:blipFill>
+                    <a:blip r:embed="rId7"/>
+                    <a:stretch>
+                      <a:fillRect/>
+                    </a:stretch>
+                  </pic:blipFill>
+                  <pic:spPr>
+                    <a:xfrm>
+                      <a:off x="0" y="0"/>
+                      <a:ext cx="5943600" cy="3331845"/>
+                    </a:xfrm>
+                    <a:prstGeom prst="rect">
+                      <a:avLst/>
+                    </a:prstGeom>
+                  </pic:spPr>
+                </pic:pic>
+              </a:graphicData>
+            </a:graphic>
+          </wp:inline>
+        </w:drawing>
+      </w:r>
+    </w:p>
+    <w:p>
+      <w:pPr>
+        <w:rPr>
+          <w:rFonts w:ascii="Times New Roman" w:hAnsi="Times New Roman" w:cs="Times New Roman"/>
+          <w:sz w:val="24"/>
+          <w:szCs w:val="24"/>
+        </w:rPr>
+      </w:pPr>
+      <w:r>
+        <w:rPr>
+          <w:rFonts w:ascii="Times New Roman" w:hAnsi="Times New Roman" w:cs="Times New Roman"/>
+          <w:sz w:val="24"/>
+          <w:szCs w:val="24"/>
+        </w:rPr>
+        <w:drawing>
+          <wp:inline distT="0" distB="0" distL="0" distR="0" wp14:anchorId="5499E804" wp14:editId="513C4AA5">
+            <wp:extent cx="5943600" cy="3335655"/>
+            <wp:effectExtent l="0" t="0" r="0" b="0"/>
+            <wp:docPr id="5" name="Hình ảnh 5"/>
+            <wp:cNvGraphicFramePr>
+              <a:graphicFrameLocks xmlns:a="http://schemas.openxmlformats.org/drawingml/2006/main" noChangeAspect="1"/>
+            </wp:cNvGraphicFramePr>
+            <a:graphic xmlns:a="http://schemas.openxmlformats.org/drawingml/2006/main">
+              <a:graphicData uri="http://schemas.openxmlformats.org/drawingml/2006/picture">
+                <pic:pic xmlns:pic="http://schemas.openxmlformats.org/drawingml/2006/picture">
+                  <pic:nvPicPr>
+                    <pic:cNvPr id="1" name=""/>
+                    <pic:cNvPicPr/>
+                  </pic:nvPicPr>
+                  <pic:blipFill>
+                    <a:blip r:embed="rId8"/>
+                    <a:stretch>
+                      <a:fillRect/>
+                    </a:stretch>
+                  </pic:blipFill>
+                  <pic:spPr>
+                    <a:xfrm>
+                      <a:off x="0" y="0"/>
+                      <a:ext cx="5943600" cy="3335655"/>
+                    </a:xfrm>
+                    <a:prstGeom prst="rect">
+                      <a:avLst/>
+                    </a:prstGeom>
+                  </pic:spPr>
+                </pic:pic>
+              </a:graphicData>
+            </a:graphic>
+          </wp:inline>
+        </w:drawing>
+      </w:r>
+    </w:p>
+    <w:p>
+      <w:pPr>
+        <w:rPr>
+          <w:rFonts w:ascii="Times New Roman" w:hAnsi="Times New Roman" w:cs="Times New Roman"/>
+          <w:sz w:val="24"/>
+          <w:szCs w:val="24"/>
+        </w:rPr>
+      </w:pPr>
+    </w:p>
+    <w:p>
+      <w:pPr>
+        <w:rPr>
+          <w:rFonts w:ascii="Times New Roman" w:hAnsi="Times New Roman" w:cs="Times New Roman"/>
+          <w:sz w:val="24"/>
+          <w:szCs w:val="24"/>
+        </w:rPr>
+      </w:pPr>
+    </w:p>
+    <w:p>
+      <w:pPr>
+        <w:rPr>
+          <w:rFonts w:ascii="Times New Roman" w:hAnsi="Times New Roman" w:cs="Times New Roman"/>
+          <w:sz w:val="24"/>
+          <w:szCs w:val="24"/>
+        </w:rPr>
+      </w:pPr>
+    </w:p>
+    <w:p>
+      <w:pPr>
+        <w:pStyle w:val="oancuaDanhsach"/>
+        <w:numPr>
+          <w:ilvl w:val="0"/>
+          <w:numId w:val="1"/>
+        </w:numPr>
+        <w:rPr>
+          <w:rFonts w:ascii="Times New Roman" w:hAnsi="Times New Roman" w:cs="Times New Roman"/>
+          <w:sz w:val="24"/>
+          <w:szCs w:val="24"/>
+        </w:rPr>
+      </w:pPr>
+      <w:r>
+        <w:rPr>
+          <w:rFonts w:ascii="Times New Roman" w:hAnsi="Times New Roman" w:cs="Times New Roman"/>
+          <w:sz w:val="24"/>
+          <w:szCs w:val="24"/>
+        </w:rPr>
+        <w:lastRenderedPageBreak/>
+        <w:t>Send message (Trường hợp thành công)</w:t>
+      </w:r>
+    </w:p>
+    <w:p>
+      <w:pPr>
+        <w:rPr>
+          <w:rFonts w:ascii="Times New Roman" w:hAnsi="Times New Roman" w:cs="Times New Roman"/>
+          <w:sz w:val="24"/>
+          <w:szCs w:val="24"/>
+        </w:rPr>
+      </w:pPr>
+      <w:r>
+        <w:rPr>
+          <w:rFonts w:ascii="Times New Roman" w:hAnsi="Times New Roman" w:cs="Times New Roman"/>
+          <w:sz w:val="24"/>
+          <w:szCs w:val="24"/>
+        </w:rPr>
+        <w:drawing>
+          <wp:inline distT="0" distB="0" distL="0" distR="0" wp14:anchorId="6A705816" wp14:editId="3C5BC6EB">
+            <wp:extent cx="5943600" cy="3291205"/>
+            <wp:effectExtent l="0" t="0" r="0" b="4445"/>
+            <wp:docPr id="6" name="Hình ảnh 6"/>
+            <wp:cNvGraphicFramePr>
+              <a:graphicFrameLocks xmlns:a="http://schemas.openxmlformats.org/drawingml/2006/main" noChangeAspect="1"/>
+            </wp:cNvGraphicFramePr>
+            <a:graphic xmlns:a="http://schemas.openxmlformats.org/drawingml/2006/main">
+              <a:graphicData uri="http://schemas.openxmlformats.org/drawingml/2006/picture">
+                <pic:pic xmlns:pic="http://schemas.openxmlformats.org/drawingml/2006/picture">
+                  <pic:nvPicPr>
+                    <pic:cNvPr id="1" name=""/>
+                    <pic:cNvPicPr/>
+                  </pic:nvPicPr>
+                  <pic:blipFill>
+                    <a:blip r:embed="rId9"/>
+                    <a:stretch>
+                      <a:fillRect/>
+                    </a:stretch>
+                  </pic:blipFill>
+                  <pic:spPr>
+                    <a:xfrm>
+                      <a:off x="0" y="0"/>
+                      <a:ext cx="5943600" cy="3291205"/>
+                    </a:xfrm>
+                    <a:prstGeom prst="rect">
+                      <a:avLst/>
+                    </a:prstGeom>
+                  </pic:spPr>
+                </pic:pic>
+              </a:graphicData>
+            </a:graphic>
+          </wp:inline>
+        </w:drawing>
+      </w:r>
+    </w:p>
+    <w:p>
+      <w:pPr>
+        <w:rPr>
+          <w:rFonts w:ascii="Times New Roman" w:hAnsi="Times New Roman" w:cs="Times New Roman"/>
+          <w:sz w:val="24"/>
+          <w:szCs w:val="24"/>
+        </w:rPr>
+      </w:pPr>
+      <w:r>
+        <w:rPr>
+          <w:rFonts w:ascii="Times New Roman" w:hAnsi="Times New Roman" w:cs="Times New Roman"/>
+          <w:sz w:val="24"/>
+          <w:szCs w:val="24"/>
+        </w:rPr>
+        <w:drawing>
+          <wp:inline distT="0" distB="0" distL="0" distR="0" wp14:anchorId="2512A983" wp14:editId="639154EF">
+            <wp:extent cx="5943600" cy="3329305"/>
+            <wp:effectExtent l="0" t="0" r="0" b="4445"/>
+            <wp:docPr id="7" name="Hình ảnh 7"/>
+            <wp:cNvGraphicFramePr>
+              <a:graphicFrameLocks xmlns:a="http://schemas.openxmlformats.org/drawingml/2006/main" noChangeAspect="1"/>
+            </wp:cNvGraphicFramePr>
+            <a:graphic xmlns:a="http://schemas.openxmlformats.org/drawingml/2006/main">
+              <a:graphicData uri="http://schemas.openxmlformats.org/drawingml/2006/picture">
+                <pic:pic xmlns:pic="http://schemas.openxmlformats.org/drawingml/2006/picture">
+                  <pic:nvPicPr>
+                    <pic:cNvPr id="1" name=""/>
+                    <pic:cNvPicPr/>
+                  </pic:nvPicPr>
+                  <pic:blipFill>
+                    <a:blip r:embed="rId10"/>
+                    <a:stretch>
+                      <a:fillRect/>
+                    </a:stretch>
+                  </pic:blipFill>
+                  <pic:spPr>
+                    <a:xfrm>
+                      <a:off x="0" y="0"/>
+                      <a:ext cx="5943600" cy="3329305"/>
+                    </a:xfrm>
+                    <a:prstGeom prst="rect">
+                      <a:avLst/>
+                    </a:prstGeom>
+                  </pic:spPr>
+                </pic:pic>
+              </a:graphicData>
+            </a:graphic>
+          </wp:inline>
+        </w:drawing>
+      </w:r>
+    </w:p>
+    <w:p>
+      <w:pPr>
+        <w:rPr>
+          <w:rFonts w:ascii="Times New Roman" w:hAnsi="Times New Roman" w:cs="Times New Roman"/>
+          <w:sz w:val="24"/>
+          <w:szCs w:val="24"/>
+        </w:rPr>
+      </w:pPr>
+      <w:r>
+        <w:rPr>
+          <w:rFonts w:ascii="Times New Roman" w:hAnsi="Times New Roman" w:cs="Times New Roman"/>
+          <w:sz w:val="24"/>
+          <w:szCs w:val="24"/>
+        </w:rPr>
+        <w:lastRenderedPageBreak/>
+        <w:drawing>
+          <wp:inline distT="0" distB="0" distL="0" distR="0" wp14:anchorId="6071D3BB" wp14:editId="59B03AEC">
+            <wp:extent cx="5943600" cy="3324225"/>
+            <wp:effectExtent l="0" t="0" r="0" b="9525"/>
+            <wp:docPr id="8" name="Hình ảnh 8"/>
+            <wp:cNvGraphicFramePr>
+              <a:graphicFrameLocks xmlns:a="http://schemas.openxmlformats.org/drawingml/2006/main" noChangeAspect="1"/>
+            </wp:cNvGraphicFramePr>
+            <a:graphic xmlns:a="http://schemas.openxmlformats.org/drawingml/2006/main">
+              <a:graphicData uri="http://schemas.openxmlformats.org/drawingml/2006/picture">
+                <pic:pic xmlns:pic="http://schemas.openxmlformats.org/drawingml/2006/picture">
+                  <pic:nvPicPr>
+                    <pic:cNvPr id="1" name=""/>
+                    <pic:cNvPicPr/>
+                  </pic:nvPicPr>
+                  <pic:blipFill>
+                    <a:blip r:embed="rId11"/>
+                    <a:stretch>
+                      <a:fillRect/>
+                    </a:stretch>
+                  </pic:blipFill>
+                  <pic:spPr>
+                    <a:xfrm>
+                      <a:off x="0" y="0"/>
+                      <a:ext cx="5943600" cy="3324225"/>
+                    </a:xfrm>
+                    <a:prstGeom prst="rect">
+                      <a:avLst/>
+                    </a:prstGeom>
+                  </pic:spPr>
+                </pic:pic>
+              </a:graphicData>
+            </a:graphic>
+          </wp:inline>
+        </w:drawing>
+      </w:r>
     </w:p>
     <w:sectPr>
       <w:pgSz w:w="12240" w:h="15840"/>
@@ -16,8 +518,105 @@
 </w:document>
 </file>
 
+<file path=word/numbering.xml><?xml version="1.0" encoding="utf-8"?>
+<w:numbering xmlns:wpc="http://schemas.microsoft.com/office/word/2010/wordprocessingCanvas" xmlns:cx="http://schemas.microsoft.com/office/drawing/2014/chartex" xmlns:cx1="http://schemas.microsoft.com/office/drawing/2015/9/8/chartex" xmlns:cx2="http://schemas.microsoft.com/office/drawing/2015/10/21/chartex" xmlns:cx3="http://schemas.microsoft.com/office/drawing/2016/5/9/chartex" xmlns:cx4="http://schemas.microsoft.com/office/drawing/2016/5/10/chartex" xmlns:cx5="http://schemas.microsoft.com/office/drawing/2016/5/11/chartex" xmlns:cx6="http://schemas.microsoft.com/office/drawing/2016/5/12/chartex" xmlns:cx7="http://schemas.microsoft.com/office/drawing/2016/5/13/chartex" xmlns:cx8="http://schemas.microsoft.com/office/drawing/2016/5/14/chartex" xmlns:mc="http://schemas.openxmlformats.org/markup-compatibility/2006" xmlns:aink="http://schemas.microsoft.com/office/drawing/2016/ink" xmlns:am3d="http://schemas.microsoft.com/office/drawing/2017/model3d" xmlns:o="urn:schemas-microsoft-com:office:office" xmlns:r="http://schemas.openxmlformats.org/officeDocument/2006/relationships" xmlns:m="http://schemas.openxmlformats.org/officeDocument/2006/math" xmlns:v="urn:schemas-microsoft-com:vml" xmlns:wp14="http://schemas.microsoft.com/office/word/2010/wordprocessingDrawing" xmlns:wp="http://schemas.openxmlformats.org/drawingml/2006/wordprocessingDrawing" xmlns:w10="urn:schemas-microsoft-com:office:word" xmlns:w="http://schemas.openxmlformats.org/wordprocessingml/2006/main" xmlns:w14="http://schemas.microsoft.com/office/word/2010/wordml" xmlns:w15="http://schemas.microsoft.com/office/word/2012/wordml" xmlns:w16cex="http://schemas.microsoft.com/office/word/2018/wordml/cex" xmlns:w16cid="http://schemas.microsoft.com/office/word/2016/wordml/cid" xmlns:w16="http://schemas.microsoft.com/office/word/2018/wordml" xmlns:w16sdtdh="http://schemas.microsoft.com/office/word/2020/wordml/sdtdatahash" xmlns:w16se="http://schemas.microsoft.com/office/word/2015/wordml/symex" xmlns:wpg="http://schemas.microsoft.com/office/word/2010/wordprocessingGroup" xmlns:wpi="http://schemas.microsoft.com/office/word/2010/wordprocessingInk" xmlns:wne="http://schemas.microsoft.com/office/word/2006/wordml" xmlns:wps="http://schemas.microsoft.com/office/word/2010/wordprocessingShape" mc:Ignorable="w14 w15 w16se w16cid w16 w16cex w16sdtdh wp14">
+  <w:abstractNum w:abstractNumId="0" w15:restartNumberingAfterBreak="0">
+    <w:nsid w:val="0F3922C0"/>
+    <w:multiLevelType w:val="hybridMultilevel"/>
+    <w:tmpl w:val="4F18C3B8"/>
+    <w:lvl w:ilvl="0" w:tplc="0409000F">
+      <w:start w:val="1"/>
+      <w:numFmt w:val="decimal"/>
+      <w:lvlText w:val="%1."/>
+      <w:lvlJc w:val="left"/>
+      <w:pPr>
+        <w:ind w:left="720" w:hanging="360"/>
+      </w:pPr>
+      <w:rPr>
+        <w:rFonts w:hint="default"/>
+      </w:rPr>
+    </w:lvl>
+    <w:lvl w:ilvl="1" w:tplc="04090019" w:tentative="1">
+      <w:start w:val="1"/>
+      <w:numFmt w:val="lowerLetter"/>
+      <w:lvlText w:val="%2."/>
+      <w:lvlJc w:val="left"/>
+      <w:pPr>
+        <w:ind w:left="1440" w:hanging="360"/>
+      </w:pPr>
+    </w:lvl>
+    <w:lvl w:ilvl="2" w:tplc="0409001B" w:tentative="1">
+      <w:start w:val="1"/>
+      <w:numFmt w:val="lowerRoman"/>
+      <w:lvlText w:val="%3."/>
+      <w:lvlJc w:val="right"/>
+      <w:pPr>
+        <w:ind w:left="2160" w:hanging="180"/>
+      </w:pPr>
+    </w:lvl>
+    <w:lvl w:ilvl="3" w:tplc="0409000F" w:tentative="1">
+      <w:start w:val="1"/>
+      <w:numFmt w:val="decimal"/>
+      <w:lvlText w:val="%4."/>
+      <w:lvlJc w:val="left"/>
+      <w:pPr>
+        <w:ind w:left="2880" w:hanging="360"/>
+      </w:pPr>
+    </w:lvl>
+    <w:lvl w:ilvl="4" w:tplc="04090019" w:tentative="1">
+      <w:start w:val="1"/>
+      <w:numFmt w:val="lowerLetter"/>
+      <w:lvlText w:val="%5."/>
+      <w:lvlJc w:val="left"/>
+      <w:pPr>
+        <w:ind w:left="3600" w:hanging="360"/>
+      </w:pPr>
+    </w:lvl>
+    <w:lvl w:ilvl="5" w:tplc="0409001B" w:tentative="1">
+      <w:start w:val="1"/>
+      <w:numFmt w:val="lowerRoman"/>
+      <w:lvlText w:val="%6."/>
+      <w:lvlJc w:val="right"/>
+      <w:pPr>
+        <w:ind w:left="4320" w:hanging="180"/>
+      </w:pPr>
+    </w:lvl>
+    <w:lvl w:ilvl="6" w:tplc="0409000F" w:tentative="1">
+      <w:start w:val="1"/>
+      <w:numFmt w:val="decimal"/>
+      <w:lvlText w:val="%7."/>
+      <w:lvlJc w:val="left"/>
+      <w:pPr>
+        <w:ind w:left="5040" w:hanging="360"/>
+      </w:pPr>
+    </w:lvl>
+    <w:lvl w:ilvl="7" w:tplc="04090019" w:tentative="1">
+      <w:start w:val="1"/>
+      <w:numFmt w:val="lowerLetter"/>
+      <w:lvlText w:val="%8."/>
+      <w:lvlJc w:val="left"/>
+      <w:pPr>
+        <w:ind w:left="5760" w:hanging="360"/>
+      </w:pPr>
+    </w:lvl>
+    <w:lvl w:ilvl="8" w:tplc="0409001B" w:tentative="1">
+      <w:start w:val="1"/>
+      <w:numFmt w:val="lowerRoman"/>
+      <w:lvlText w:val="%9."/>
+      <w:lvlJc w:val="right"/>
+      <w:pPr>
+        <w:ind w:left="6480" w:hanging="180"/>
+      </w:pPr>
+    </w:lvl>
+  </w:abstractNum>
+  <w:num w:numId="1">
+    <w:abstractNumId w:val="0"/>
+  </w:num>
+</w:numbering>
+</file>
+
 <file path=word/styles.xml><?xml version="1.0" encoding="utf-8"?>
-<w:styles xmlns:mc="http://schemas.openxmlformats.org/markup-compatibility/2006" xmlns:r="http://schemas.openxmlformats.org/officeDocument/2006/relationships" xmlns:w="http://schemas.openxmlformats.org/wordprocessingml/2006/main" xmlns:w14="http://schemas.microsoft.com/office/word/2010/wordml" xmlns:w15="http://schemas.microsoft.com/office/word/2012/wordml" mc:Ignorable="w14 w15">
+<w:styles xmlns:mc="http://schemas.openxmlformats.org/markup-compatibility/2006" xmlns:r="http://schemas.openxmlformats.org/officeDocument/2006/relationships" xmlns:w="http://schemas.openxmlformats.org/wordprocessingml/2006/main" xmlns:w14="http://schemas.microsoft.com/office/word/2010/wordml" xmlns:w15="http://schemas.microsoft.com/office/word/2012/wordml" xmlns:w16cex="http://schemas.microsoft.com/office/word/2018/wordml/cex" xmlns:w16cid="http://schemas.microsoft.com/office/word/2016/wordml/cid" xmlns:w16="http://schemas.microsoft.com/office/word/2018/wordml" xmlns:w16sdtdh="http://schemas.microsoft.com/office/word/2020/wordml/sdtdatahash" xmlns:w16se="http://schemas.microsoft.com/office/word/2015/wordml/symex" mc:Ignorable="w14 w15 w16se w16cid w16 w16cex w16sdtdh">
   <w:docDefaults>
     <w:rPrDefault>
       <w:rPr>
@@ -33,7 +632,7 @@
       </w:pPr>
     </w:pPrDefault>
   </w:docDefaults>
-  <w:latentStyles w:defLockedState="0" w:defUIPriority="99" w:defSemiHidden="0" w:defUnhideWhenUsed="0" w:defQFormat="0" w:count="371">
+  <w:latentStyles w:defLockedState="0" w:defUIPriority="99" w:defSemiHidden="0" w:defUnhideWhenUsed="0" w:defQFormat="0" w:count="376">
     <w:lsdException w:name="Normal" w:uiPriority="0" w:qFormat="1"/>
     <w:lsdException w:name="heading 1" w:uiPriority="9" w:qFormat="1"/>
     <w:lsdException w:name="heading 2" w:semiHidden="1" w:uiPriority="9" w:unhideWhenUsed="1" w:qFormat="1"/>
@@ -405,18 +1004,23 @@
     <w:lsdException w:name="List Table 5 Dark Accent 6" w:uiPriority="50"/>
     <w:lsdException w:name="List Table 6 Colorful Accent 6" w:uiPriority="51"/>
     <w:lsdException w:name="List Table 7 Colorful Accent 6" w:uiPriority="52"/>
+    <w:lsdException w:name="Mention" w:semiHidden="1" w:unhideWhenUsed="1"/>
+    <w:lsdException w:name="Smart Hyperlink" w:semiHidden="1" w:unhideWhenUsed="1"/>
+    <w:lsdException w:name="Hashtag" w:semiHidden="1" w:unhideWhenUsed="1"/>
+    <w:lsdException w:name="Unresolved Mention" w:semiHidden="1" w:unhideWhenUsed="1"/>
+    <w:lsdException w:name="Smart Link" w:semiHidden="1" w:unhideWhenUsed="1"/>
   </w:latentStyles>
-  <w:style w:type="paragraph" w:default="1" w:styleId="Normal">
+  <w:style w:type="paragraph" w:default="1" w:styleId="Binhthng">
     <w:name w:val="Normal"/>
     <w:qFormat/>
   </w:style>
-  <w:style w:type="character" w:default="1" w:styleId="DefaultParagraphFont">
+  <w:style w:type="character" w:default="1" w:styleId="Phngmcinhcuaoanvn">
     <w:name w:val="Default Paragraph Font"/>
     <w:uiPriority w:val="1"/>
     <w:semiHidden/>
     <w:unhideWhenUsed/>
   </w:style>
-  <w:style w:type="table" w:default="1" w:styleId="TableNormal">
+  <w:style w:type="table" w:default="1" w:styleId="BangThngthng">
     <w:name w:val="Normal Table"/>
     <w:uiPriority w:val="99"/>
     <w:semiHidden/>
@@ -431,11 +1035,22 @@
       </w:tblCellMar>
     </w:tblPr>
   </w:style>
-  <w:style w:type="numbering" w:default="1" w:styleId="NoList">
+  <w:style w:type="numbering" w:default="1" w:styleId="Khngco">
     <w:name w:val="No List"/>
     <w:uiPriority w:val="99"/>
     <w:semiHidden/>
     <w:unhideWhenUsed/>
+  </w:style>
+  <w:style w:type="paragraph" w:styleId="oancuaDanhsach">
+    <w:name w:val="List Paragraph"/>
+    <w:basedOn w:val="Binhthng"/>
+    <w:uiPriority w:val="34"/>
+    <w:qFormat/>
+    <w:rsid w:val="008132D7"/>
+    <w:pPr>
+      <w:ind w:left="720"/>
+      <w:contextualSpacing/>
+    </w:pPr>
   </w:style>
 </w:styles>
 </file>

</xml_diff>

<commit_message>
RabbitMQ: truong hop gui message test bang postman
</commit_message>
<xml_diff>
--- a/Tuan01/MinhChungTuan1.docx
+++ b/Tuan01/MinhChungTuan1.docx
@@ -507,6 +507,101 @@
           </wp:inline>
         </w:drawing>
       </w:r>
+    </w:p>
+    <w:p>
+      <w:pPr>
+        <w:rPr>
+          <w:rFonts w:ascii="Times New Roman" w:hAnsi="Times New Roman" w:cs="Times New Roman"/>
+          <w:sz w:val="24"/>
+          <w:szCs w:val="24"/>
+        </w:rPr>
+      </w:pPr>
+      <w:r>
+        <w:rPr>
+          <w:rFonts w:ascii="Times New Roman" w:hAnsi="Times New Roman" w:cs="Times New Roman"/>
+          <w:sz w:val="24"/>
+          <w:szCs w:val="24"/>
+        </w:rPr>
+        <w:t>Test bằng postman</w:t>
+      </w:r>
+    </w:p>
+    <w:p>
+      <w:pPr>
+        <w:rPr>
+          <w:rFonts w:ascii="Times New Roman" w:hAnsi="Times New Roman" w:cs="Times New Roman"/>
+          <w:sz w:val="24"/>
+          <w:szCs w:val="24"/>
+        </w:rPr>
+      </w:pPr>
+      <w:r>
+        <w:rPr>
+          <w:rFonts w:ascii="Times New Roman" w:hAnsi="Times New Roman" w:cs="Times New Roman"/>
+          <w:sz w:val="24"/>
+          <w:szCs w:val="24"/>
+        </w:rPr>
+        <w:drawing>
+          <wp:inline distT="0" distB="0" distL="0" distR="0" wp14:anchorId="5829A6C0" wp14:editId="367D0AC7">
+            <wp:extent cx="5943600" cy="3344545"/>
+            <wp:effectExtent l="0" t="0" r="0" b="8255"/>
+            <wp:docPr id="11" name="Hình ảnh 11"/>
+            <wp:cNvGraphicFramePr>
+              <a:graphicFrameLocks xmlns:a="http://schemas.openxmlformats.org/drawingml/2006/main" noChangeAspect="1"/>
+            </wp:cNvGraphicFramePr>
+            <a:graphic xmlns:a="http://schemas.openxmlformats.org/drawingml/2006/main">
+              <a:graphicData uri="http://schemas.openxmlformats.org/drawingml/2006/picture">
+                <pic:pic xmlns:pic="http://schemas.openxmlformats.org/drawingml/2006/picture">
+                  <pic:nvPicPr>
+                    <pic:cNvPr id="1" name=""/>
+                    <pic:cNvPicPr/>
+                  </pic:nvPicPr>
+                  <pic:blipFill>
+                    <a:blip r:embed="rId12"/>
+                    <a:stretch>
+                      <a:fillRect/>
+                    </a:stretch>
+                  </pic:blipFill>
+                  <pic:spPr>
+                    <a:xfrm>
+                      <a:off x="0" y="0"/>
+                      <a:ext cx="5943600" cy="3344545"/>
+                    </a:xfrm>
+                    <a:prstGeom prst="rect">
+                      <a:avLst/>
+                    </a:prstGeom>
+                  </pic:spPr>
+                </pic:pic>
+              </a:graphicData>
+            </a:graphic>
+          </wp:inline>
+        </w:drawing>
+      </w:r>
+    </w:p>
+    <w:p>
+      <w:pPr>
+        <w:rPr>
+          <w:rFonts w:ascii="Times New Roman" w:hAnsi="Times New Roman" w:cs="Times New Roman"/>
+          <w:sz w:val="24"/>
+          <w:szCs w:val="24"/>
+        </w:rPr>
+      </w:pPr>
+    </w:p>
+    <w:p>
+      <w:pPr>
+        <w:rPr>
+          <w:rFonts w:ascii="Times New Roman" w:hAnsi="Times New Roman" w:cs="Times New Roman"/>
+          <w:sz w:val="24"/>
+          <w:szCs w:val="24"/>
+        </w:rPr>
+      </w:pPr>
+    </w:p>
+    <w:p>
+      <w:pPr>
+        <w:rPr>
+          <w:rFonts w:ascii="Times New Roman" w:hAnsi="Times New Roman" w:cs="Times New Roman"/>
+          <w:sz w:val="24"/>
+          <w:szCs w:val="24"/>
+        </w:rPr>
+      </w:pPr>
     </w:p>
     <w:sectPr>
       <w:pgSz w:w="12240" w:h="15840"/>

</xml_diff>